<commit_message>
Feature flagship projects on resume
</commit_message>
<xml_diff>
--- a/Kas_Dudzinski_resume.docx
+++ b/Kas_Dudzinski_resume.docx
@@ -69,7 +69,7 @@
           <w:i w:val="0"/>
           <w:sz w:val="20"/>
         </w:rPr>
-        <w:t>Data Engineer / Software Developer with 6+ years of experience building AWS-based data pipelines and automation for financial services systems. Skilled in Python, SQL, Spark, Glue, Redshift, S3, and Step Functions, with practical experience using AI coding tools to support debugging, refactoring, and faster development.</w:t>
+        <w:t>Data Engineer / Software Developer with 6+ years of experience building AWS-based data pipelines and automation for financial services systems. Skilled in Python, SQL, Spark, AWS, and Terraform, with hands-on experience building event-driven serverless systems end to end.</w:t>
       </w:r>
     </w:p>
     <w:p>
@@ -106,7 +106,7 @@
           <w:i w:val="0"/>
           <w:sz w:val="20"/>
         </w:rPr>
-        <w:t>Python, SQL, Kotlin</w:t>
+        <w:t>Python, SQL, JavaScript, Kotlin</w:t>
       </w:r>
     </w:p>
     <w:p>
@@ -129,7 +129,7 @@
           <w:i w:val="0"/>
           <w:sz w:val="20"/>
         </w:rPr>
-        <w:t>Glue, Redshift, S3, Step Functions, EC2, CloudWatch</w:t>
+        <w:t>Glue, Redshift, S3, Lambda, SQS, DynamoDB, EventBridge, Step Functions, EC2, CloudWatch</w:t>
       </w:r>
     </w:p>
     <w:p>
@@ -143,7 +143,7 @@
           <w:i w:val="0"/>
           <w:sz w:val="20"/>
         </w:rPr>
-        <w:t xml:space="preserve">Data &amp; Tools: </w:t>
+        <w:t xml:space="preserve">Data, Cloud &amp; Tools: </w:t>
       </w:r>
       <w:r>
         <w:rPr>
@@ -152,7 +152,7 @@
           <w:i w:val="0"/>
           <w:sz w:val="20"/>
         </w:rPr>
-        <w:t>Apache Spark, ETL Pipelines, Git, GitLab, Jira, Parquet, Data Modeling</w:t>
+        <w:t>Apache Spark, Terraform, Cloudflare Workers, D1, Git, GitLab, Jira, Parquet, Data Modeling</w:t>
       </w:r>
     </w:p>
     <w:p>
@@ -175,7 +175,7 @@
           <w:i w:val="0"/>
           <w:sz w:val="20"/>
         </w:rPr>
-        <w:t>Claude Code, OpenAI Codex, GitHub Copilot</w:t>
+        <w:t>Claude Code, OpenAI Codex, GitHub Copilot, Groq API</w:t>
       </w:r>
     </w:p>
     <w:p>
@@ -305,21 +305,6 @@
       </w:r>
     </w:p>
     <w:p>
-      <w:pPr>
-        <w:spacing w:after="0"/>
-        <w:ind w:left="259" w:hanging="173"/>
-      </w:pPr>
-      <w:r>
-        <w:rPr>
-          <w:rFonts w:ascii="Arial" w:hAnsi="Arial"/>
-          <w:b w:val="0"/>
-          <w:i w:val="0"/>
-          <w:sz w:val="20"/>
-        </w:rPr>
-        <w:t>- Used GitHub Copilot to support debugging, refactoring, and development of Python/SQL data pipeline code during later-stage project work</w:t>
-      </w:r>
-    </w:p>
-    <w:p>
       <w:r>
         <w:rPr>
           <w:rFonts w:ascii="Arial" w:hAnsi="Arial"/>
@@ -378,7 +363,7 @@
           <w:i w:val="0"/>
           <w:sz w:val="20"/>
         </w:rPr>
-        <w:t>Remindr</w:t>
+        <w:t>aws-ingestion</w:t>
       </w:r>
       <w:r>
         <w:rPr>
@@ -387,7 +372,7 @@
           <w:i w:val="0"/>
           <w:sz w:val="20"/>
         </w:rPr>
-        <w:t xml:space="preserve"> | Kotlin, Android Studio | github.com/kadspace/remindr</w:t>
+        <w:t xml:space="preserve"> | Python, AWS, Terraform | github.com/kadspace/aws-ingestion</w:t>
       </w:r>
     </w:p>
     <w:p>
@@ -402,7 +387,7 @@
           <w:i w:val="0"/>
           <w:sz w:val="20"/>
         </w:rPr>
-        <w:t>- Developing Android productivity app combining calendar and reminder functionality with a focus on clean UX and practical task management</w:t>
+        <w:t>- Built an event-driven telemetry pipeline using EventBridge, Lambda, SQS/DLQ, and DynamoDB, with infrastructure managed in Terraform</w:t>
       </w:r>
     </w:p>
     <w:p>
@@ -417,7 +402,29 @@
           <w:i w:val="0"/>
           <w:sz w:val="20"/>
         </w:rPr>
-        <w:t>- Used Claude Code and OpenAI Codex as development assistants for Kotlin/Android debugging, refactoring, and feature prototyping</w:t>
+        <w:t>- Added idempotent writes, partial batch failure handling, Secrets Manager-backed Discord alerts, and CloudWatch monitoring for resilient ingestion</w:t>
+      </w:r>
+    </w:p>
+    <w:p>
+      <w:pPr>
+        <w:spacing w:after="0"/>
+        <w:ind w:left="259" w:hanging="173"/>
+      </w:pPr>
+      <w:r>
+        <w:rPr>
+          <w:rFonts w:ascii="Arial" w:hAnsi="Arial"/>
+          <w:b/>
+          <w:i w:val="0"/>
+          <w:sz w:val="20"/>
+        </w:rPr>
+        <w:t>Remindr</w:t>
+      </w:r>
+      <w:r>
+        <w:rPr>
+          <w:rFonts w:ascii="Arial" w:hAnsi="Arial"/>
+          <w:b w:val="0"/>
+        </w:rPr>
+        <w:t xml:space="preserve"> | Kotlin Multiplatform, Compose, Groq | github.com/kadspace/remindr</w:t>
       </w:r>
     </w:p>
     <w:p>
@@ -432,7 +439,42 @@
           <w:i w:val="0"/>
           <w:sz w:val="20"/>
         </w:rPr>
-        <w:t>- Exploring AI-powered smart reminder suggestions, including natural-language reminder creation and context-aware task recommendations</w:t>
+        <w:t>- Built a local-first reminder and note app with recurring schedules, calendar views, and optional Groq-powered natural-language parsing</w:t>
+      </w:r>
+    </w:p>
+    <w:p>
+      <w:r>
+        <w:rPr>
+          <w:rFonts w:ascii="Arial" w:hAnsi="Arial"/>
+          <w:b/>
+          <w:i w:val="0"/>
+          <w:sz w:val="20"/>
+        </w:rPr>
+        <w:t>solovolo</w:t>
+      </w:r>
+      <w:r>
+        <w:rPr>
+          <w:rFonts w:ascii="Arial" w:hAnsi="Arial"/>
+          <w:b w:val="0"/>
+          <w:i w:val="0"/>
+          <w:sz w:val="20"/>
+        </w:rPr>
+        <w:t xml:space="preserve"> | JavaScript, Cloudflare Workers, D1 | github.com/kadspace/solovolo</w:t>
+      </w:r>
+    </w:p>
+    <w:p>
+      <w:pPr>
+        <w:spacing w:after="0"/>
+        <w:ind w:left="259" w:hanging="173"/>
+      </w:pPr>
+      <w:r>
+        <w:rPr>
+          <w:rFonts w:ascii="Arial" w:hAnsi="Arial"/>
+          <w:b w:val="0"/>
+          <w:i w:val="0"/>
+          <w:sz w:val="20"/>
+        </w:rPr>
+        <w:t>- Deployed a cron-triggered service that tracks Volo Sports listings in D1 and sends filtered Discord alerts when eligible spots appear</w:t>
       </w:r>
     </w:p>
     <w:p>

</xml_diff>

<commit_message>
Keep resume PDF compact and ATS-readable
</commit_message>
<xml_diff>
--- a/Kas_Dudzinski_resume.docx
+++ b/Kas_Dudzinski_resume.docx
@@ -152,7 +152,7 @@
           <w:i w:val="0"/>
           <w:sz w:val="20"/>
         </w:rPr>
-        <w:t>Apache Spark, Terraform, Cloudflare Workers, D1, Git, GitLab, Jira, Parquet, Data Modeling</w:t>
+        <w:t>Apache Spark, Terraform, Cloudflare Workers, Git, GitLab, Jira, Parquet, Data Modeling</w:t>
       </w:r>
     </w:p>
     <w:p>
@@ -459,7 +459,7 @@
           <w:i w:val="0"/>
           <w:sz w:val="20"/>
         </w:rPr>
-        <w:t xml:space="preserve"> | JavaScript, Cloudflare Workers, D1 | github.com/kadspace/solovolo</w:t>
+        <w:t xml:space="preserve"> | JavaScript, Cloudflare Workers | github.com/kadspace/solovolo</w:t>
       </w:r>
     </w:p>
     <w:p>
@@ -474,7 +474,7 @@
           <w:i w:val="0"/>
           <w:sz w:val="20"/>
         </w:rPr>
-        <w:t>- Deployed a cron-triggered service that tracks Volo Sports listings in D1 and sends filtered Discord alerts when eligible spots appear</w:t>
+        <w:t>- Deployed a cron-triggered service that tracks Volo Sports listings and notification state, sending filtered Discord alerts when eligible spots appear</w:t>
       </w:r>
     </w:p>
     <w:p>

</xml_diff>

<commit_message>
Correct resume tenure and EMR wording
</commit_message>
<xml_diff>
--- a/Kas_Dudzinski_resume.docx
+++ b/Kas_Dudzinski_resume.docx
@@ -69,7 +69,7 @@
           <w:i w:val="0"/>
           <w:sz w:val="20"/>
         </w:rPr>
-        <w:t>Data Engineer / Software Developer with 6+ years of experience building AWS-based data pipelines and automation for financial services systems. Skilled in Python, SQL, Spark, AWS, and Terraform, with hands-on experience building event-driven serverless systems end to end.</w:t>
+        <w:t>Data Engineer / Software Developer with 6 years of experience building AWS-based data pipelines and automation for financial services systems. Skilled in Python, SQL, Spark, AWS, and Terraform, with hands-on experience building event-driven serverless systems end to end.</w:t>
       </w:r>
     </w:p>
     <w:p>
@@ -129,7 +129,7 @@
           <w:i w:val="0"/>
           <w:sz w:val="20"/>
         </w:rPr>
-        <w:t>Glue, Redshift, S3, Lambda, SQS, DynamoDB, EventBridge, Step Functions, EC2, CloudWatch</w:t>
+        <w:t>Glue, Redshift, S3, Lambda, SQS, DynamoDB, EventBridge, Step Functions, EMR, CloudWatch</w:t>
       </w:r>
     </w:p>
     <w:p>
@@ -241,7 +241,7 @@
           <w:i w:val="0"/>
           <w:sz w:val="20"/>
         </w:rPr>
-        <w:t>- Develop and optimize Spark jobs running on EC2 instances, orchestrated via AWS Step Functions for daily batch processing</w:t>
+        <w:t>- Develop and optimize Spark jobs on Amazon EMR, orchestrated with AWS Step Functions for daily batch processing</w:t>
       </w:r>
     </w:p>
     <w:p>

</xml_diff>